<commit_message>
feat: Add docx post-processor and quality heuristics for PDF to Word
Enhances the PDF to Word pipeline by post-processing the output of pdf2docx.
Adds heuristics to merge broken paragraphs, fix Chinese-English spacing, and recover basic list/heading styles.
Upgrades the DOCX validator to generate specific quality metrics (e.g., table recovery, math fragmentation risks) and attach warnings when layout fidelity degrades.
Updates the Vue frontend to gracefully display these warnings to the user.

Co-authored-by: google-labs-jules[bot] <161369871+google-labs-jules[bot]@users.noreply.github.com>
</commit_message>
<xml_diff>
--- a/backend/test_output/test_real.docx
+++ b/backend/test_output/test_real.docx
@@ -100,15 +100,42 @@
         <w:autoSpaceDN w:val="0"/>
         <w:autoSpaceDE w:val="0"/>
         <w:widowControl/>
-        <w:spacing w:line="318" w:lineRule="exact" w:before="240" w:after="120"/>
+        <w:spacing w:line="318" w:lineRule="exact" w:before="576" w:after="0"/>
         <w:ind w:left="4" w:right="90" w:firstLine="0"/>
         <w:jc w:val="both"/>
       </w:pPr>
       <w:r>
-        <w:rPr>
-          <w:b/>
-        </w:rPr>
-        <w:t>【题型 1  频率的计算】................................................................................................................................................2【题型 2  辨析概率与频率的关系】............................................................................................................................3【题型 3  天气预报、抽奖、彩票的概率解释】.......................................................................................................4【题型 4  其他问题中的概率解释】............................................................................................................................4【题型 5  游戏的公平性问题】....................................................................................................................................5【题型 6  频率估计概率在统计中的应用】................................................................................................................6【题型 7  随机模拟问题】............................................................................................................................................9</w:t>
+        <w:t>【题型 1 频率的计算】................................................................................................................................................2</w:t>
+      </w:r>
+    </w:p>
+    <w:p>
+      <w:r>
+        <w:t>【题型 2 辨析概率与频率的关系】............................................................................................................................3</w:t>
+      </w:r>
+    </w:p>
+    <w:p>
+      <w:r>
+        <w:t>【题型 3 天气预报、抽奖、彩票的概率解释】.......................................................................................................4</w:t>
+      </w:r>
+    </w:p>
+    <w:p>
+      <w:r>
+        <w:t>【题型 4 其他问题中的概率解释】............................................................................................................................4</w:t>
+      </w:r>
+    </w:p>
+    <w:p>
+      <w:r>
+        <w:t>【题型 5 游戏的公平性问题】....................................................................................................................................5</w:t>
+      </w:r>
+    </w:p>
+    <w:p>
+      <w:r>
+        <w:t>【题型 6 频率估计概率在统计中的应用】................................................................................................................6</w:t>
+      </w:r>
+    </w:p>
+    <w:p>
+      <w:r>
+        <w:t>【题型 7 随机模拟问题】............................................................................................................................................9</w:t>
       </w:r>
     </w:p>
     <w:p>
@@ -176,7 +203,7 @@
         <w:rPr>
           <w:b/>
         </w:rPr>
-        <w:t>【知识点 1  频率的稳定性】</w:t>
+        <w:t>【知识点 1 频率的稳定性】</w:t>
       </w:r>
     </w:p>
     <w:p>
@@ -1048,9 +1075,7 @@
         <w:jc w:val="left"/>
       </w:pPr>
       <w:r>
-        <w:t>(3)频率的稳定性(用频率估计概率)</w:t>
-        <w:br/>
-        <w:t>大量试验表明，在任何确定次数的随机试验中，一个随机事件 A 发生的频率具有随机性.一般地，随着</w:t>
+        <w:t>(3)频率的稳定性(用频率估计概率) 大量试验表明，在任何确定次数的随机试验中，一个随机事件 A 发生的频率具有随机性.一般地，随着</w:t>
       </w:r>
     </w:p>
     <w:p>
@@ -1082,14 +1107,7 @@
         <w:jc w:val="left"/>
       </w:pPr>
       <w:r>
-        <w:tab/>
-        <w:t>2．生活中的概率</w:t>
-        <w:br/>
-        <w:tab/>
-        <w:t>(1)游戏的公平性</w:t>
-        <w:br/>
-        <w:tab/>
-        <w:t xml:space="preserve">在各类游戏中，如果每个游戏参与者获胜的概率相等，那么游戏是公平的.例如，在体育比赛中，裁判员用抽签器决定两个运动员谁先发球，两个运动员获得发球权的概率均为 0.5，所以这个规则是公平的. </w:t>
+        <w:t>2．生活中的概率 (1)游戏的公平性 在各类游戏中，如果每个游戏参与者获胜的概率相等，那么游戏是公平的.例如，在体育比赛中，裁判员用抽签器决定两个运动员谁先发球，两个运动员获得发球权的概率均为 0.5，所以这个规则是公平的.</w:t>
       </w:r>
     </w:p>
     <w:p>
@@ -1105,93 +1123,7 @@
         <w:jc w:val="left"/>
       </w:pPr>
       <w:r>
-        <w:tab/>
-      </w:r>
-      <w:r>
-        <w:rPr>
-          <w:rFonts w:ascii="Liberation Serif" w:hAnsi="Liberation Serif" w:eastAsia="Liberation Serif"/>
-          <w:b w:val="0"/>
-          <w:i w:val="0"/>
-          <w:color w:val="000000"/>
-          <w:sz w:val="21"/>
-        </w:rPr>
-        <w:t>(2)</w:t>
-      </w:r>
-      <w:r>
-        <w:rPr>
-          <w:rFonts w:ascii="NotoSansCJKsc" w:hAnsi="NotoSansCJKsc" w:eastAsia="NotoSansCJKsc"/>
-          <w:b w:val="0"/>
-          <w:i w:val="0"/>
-          <w:color w:val="000000"/>
-          <w:sz w:val="21"/>
-        </w:rPr>
-        <w:t>天气预报的概率解释</w:t>
-      </w:r>
-      <w:r>
-        <w:br/>
-      </w:r>
-      <w:r>
-        <w:tab/>
-      </w:r>
-      <w:r>
-        <w:rPr>
-          <w:rFonts w:ascii="NotoSansCJKsc" w:hAnsi="NotoSansCJKsc" w:eastAsia="NotoSansCJKsc"/>
-          <w:b w:val="0"/>
-          <w:i w:val="0"/>
-          <w:color w:val="000000"/>
-          <w:sz w:val="21"/>
-        </w:rPr>
-        <w:t>天气预报是气象专家依据气象观测资料和气象学理论以及专家们的实际经验，经过分析推断得到的</w:t>
-      </w:r>
-      <w:r>
-        <w:rPr>
-          <w:rFonts w:ascii="Liberation Serif" w:hAnsi="Liberation Serif" w:eastAsia="Liberation Serif"/>
-          <w:b w:val="0"/>
-          <w:i w:val="0"/>
-          <w:color w:val="000000"/>
-          <w:sz w:val="21"/>
-        </w:rPr>
-        <w:t>.</w:t>
-      </w:r>
-      <w:r>
-        <w:rPr>
-          <w:rFonts w:ascii="NotoSansCJKsc" w:hAnsi="NotoSansCJKsc" w:eastAsia="NotoSansCJKsc"/>
-          <w:b w:val="0"/>
-          <w:i w:val="0"/>
-          <w:color w:val="000000"/>
-          <w:sz w:val="21"/>
-        </w:rPr>
-        <w:t>天</w:t>
-      </w:r>
-      <w:r>
-        <w:rPr>
-          <w:rFonts w:ascii="NotoSansCJKsc" w:hAnsi="NotoSansCJKsc" w:eastAsia="NotoSansCJKsc"/>
-          <w:b w:val="0"/>
-          <w:i w:val="0"/>
-          <w:color w:val="000000"/>
-          <w:sz w:val="21"/>
-        </w:rPr>
-        <w:t>气预报的概率属于主观概率，这是因为在现有的条件下，不能对“天气”做多次重复试验，进行规律的总</w:t>
-      </w:r>
-      <w:r>
-        <w:rPr>
-          <w:rFonts w:ascii="NotoSansCJKsc" w:hAnsi="NotoSansCJKsc" w:eastAsia="NotoSansCJKsc"/>
-          <w:b w:val="0"/>
-          <w:i w:val="0"/>
-          <w:color w:val="000000"/>
-          <w:sz w:val="21"/>
-        </w:rPr>
-        <w:t>结，因此，在天气预报中所提及的概率和我们前面通过频率稳定性来定义的概率并不一样</w:t>
-      </w:r>
-      <w:r>
-        <w:rPr>
-          <w:rFonts w:ascii="Liberation Serif" w:hAnsi="Liberation Serif" w:eastAsia="Liberation Serif"/>
-          <w:b w:val="0"/>
-          <w:i w:val="0"/>
-          <w:color w:val="000000"/>
-          <w:sz w:val="21"/>
-        </w:rPr>
-        <w:t>.</w:t>
+        <w:t>(2)天气预报的概率解释 天气预报是气象专家依据气象观测资料和气象学理论以及专家们的实际经验，经过分析推断得到的.天气预报的概率属于主观概率，这是因为在现有的条件下，不能对“天气”做多次重复试验，进行规律的总结，因此，在天气预报中所提及的概率和我们前面通过频率稳定性来定义的概率并不一样.</w:t>
       </w:r>
     </w:p>
     <w:p>
@@ -1220,7 +1152,7 @@
         <w:rPr>
           <w:b/>
         </w:rPr>
-        <w:t>【题型 1  频率的计算】</w:t>
+        <w:t>【题型 1 频率的计算】</w:t>
       </w:r>
     </w:p>
     <w:p>
@@ -1845,64 +1777,13 @@
         <w:jc w:val="left"/>
       </w:pPr>
       <w:r>
-        <w:rPr>
-          <w:rFonts w:ascii="NotoSansCJKsc" w:hAnsi="NotoSansCJKsc" w:eastAsia="NotoSansCJKsc"/>
-          <w:b w:val="0"/>
-          <w:i w:val="0"/>
-          <w:color w:val="000000"/>
-          <w:sz w:val="21"/>
-        </w:rPr>
-        <w:t>则该植物一年生长在</w:t>
+        <w:t>则该植物一年生长在[30，40）内的频率是（ ）</w:t>
       </w:r>
       <w:r>
-        <w:rPr>
-          <w:rFonts w:ascii="Liberation Serif" w:hAnsi="Liberation Serif" w:eastAsia="Liberation Serif"/>
-          <w:b w:val="0"/>
-          <w:i w:val="0"/>
-          <w:color w:val="000000"/>
-          <w:sz w:val="21"/>
-        </w:rPr>
-        <w:t>[30</w:t>
+        <w:t>A．0.80 B．0.65</w:t>
       </w:r>
       <w:r>
-        <w:rPr>
-          <w:rFonts w:ascii="NotoSansCJKsc" w:hAnsi="NotoSansCJKsc" w:eastAsia="NotoSansCJKsc"/>
-          <w:b w:val="0"/>
-          <w:i w:val="0"/>
-          <w:color w:val="000000"/>
-          <w:sz w:val="21"/>
-        </w:rPr>
-        <w:t>，</w:t>
-      </w:r>
-      <w:r>
-        <w:rPr>
-          <w:rFonts w:ascii="Liberation Serif" w:hAnsi="Liberation Serif" w:eastAsia="Liberation Serif"/>
-          <w:b w:val="0"/>
-          <w:i w:val="0"/>
-          <w:color w:val="000000"/>
-          <w:sz w:val="21"/>
-        </w:rPr>
-        <w:t>40</w:t>
-      </w:r>
-      <w:r>
-        <w:rPr>
-          <w:rFonts w:ascii="NotoSansCJKsc" w:hAnsi="NotoSansCJKsc" w:eastAsia="NotoSansCJKsc"/>
-          <w:b w:val="0"/>
-          <w:i w:val="0"/>
-          <w:color w:val="000000"/>
-          <w:sz w:val="21"/>
-        </w:rPr>
-        <w:t>）内的频率是（  ）</w:t>
-      </w:r>
-      <w:r>
-        <w:t xml:space="preserve">A．0.80 </w:t>
-        <w:tab/>
-        <w:t>B．0.65</w:t>
-      </w:r>
-      <w:r>
-        <w:t xml:space="preserve"> C．0.40 </w:t>
-        <w:tab/>
-        <w:t>D．0.25</w:t>
+        <w:t xml:space="preserve"> C．0.40 D．0.25</w:t>
       </w:r>
     </w:p>
     <w:p>
@@ -4536,7 +4417,7 @@
         <w:rPr>
           <w:b/>
         </w:rPr>
-        <w:t>【题型 2  辨析概率与频率的关系】</w:t>
+        <w:t>【题型 2 辨析概率与频率的关系】</w:t>
       </w:r>
     </w:p>
     <w:p>
@@ -4684,23 +4565,10 @@
         <w:jc w:val="left"/>
       </w:pPr>
       <w:r>
-        <w:t xml:space="preserve">A．一个人打靶，打了 10 发子弹，有 7 发子弹中靶，因此这个人中靶的概率是 7 </w:t>
-        <w:tab/>
-        <w:t>10</w:t>
+        <w:t>A．一个人打靶，打了 10 发子弹，有 7 发子弹中靶，因此这个人中靶的概率是 7 10</w:t>
       </w:r>
       <w:r>
-        <w:t xml:space="preserve"> B．一个同学做掷硬币试验，掷了 6 次，一定有 3 次正面向上</w:t>
-        <w:br/>
-        <w:tab/>
-        <w:t>C．某地发行彩票，其回报率为 47%，有人花了 100 元钱买彩票，一定会有 47 元的回报</w:t>
-        <w:br/>
-        <w:tab/>
-        <w:t>D．大量试验后，可以用频率近似估计概率</w:t>
-        <w:br/>
-        <w:t>【变式 2-2】（23-24 高二下·上海·期中）抛一枚硬币的试验中，下列对“伯努利大数定律”的理解正确的是（）</w:t>
-        <w:br/>
-        <w:tab/>
-        <w:t>A．大量的试验中，出现正面的频率为 0.5.</w:t>
+        <w:t xml:space="preserve"> B．一个同学做掷硬币试验，掷了 6 次，一定有 3 次正面向上 C．某地发行彩票，其回报率为 47%，有人花了 100 元钱买彩票，一定会有 47 元的回报 D．大量试验后，可以用频率近似估计概率 【变式 2-2】（23-24 高二下·上海·期中）抛一枚硬币的试验中，下列对“伯努利大数定律”的理解正确的是（） A．大量的试验中，出现正面的频率为 0.5.</w:t>
       </w:r>
     </w:p>
     <w:p>
@@ -4736,22 +4604,7 @@
         <w:jc w:val="left"/>
       </w:pPr>
       <w:r>
-        <w:tab/>
-        <w:t xml:space="preserve">B．不管试验多少次，出现正面的概率始终为 0.5 </w:t>
-        <w:br/>
-        <w:tab/>
-        <w:t xml:space="preserve">C．试验次数增大，出现正面的经验概率为 0.5 </w:t>
-        <w:br/>
-        <w:tab/>
-        <w:t>D．试验次数每增加一次，下一次出现正面的频率一定比它前一次更接近于 0.5【变式 2-3】（24-25 高二上·广东佛山·阶段练习）下列说法正确的有（）</w:t>
-        <w:br/>
-        <w:t>①随机事件 A 的概率是频率的稳定值，频率是概率的估计值</w:t>
-        <w:br/>
-        <w:t>②某人打靶，射击 10 次，击中 7 次，那么此人中靶的概率 0.7</w:t>
-        <w:br/>
-        <w:t>③一位同学做掷硬币试验，掷 6 次，一定有 3 次正面朝上</w:t>
-        <w:br/>
-        <w:t>④某地发行福利彩票，回报率为 47%，有人花了 100 元钱买彩票，一定会有 47 元的回报</w:t>
+        <w:t>B．不管试验多少次，出现正面的概率始终为 0.5 C．试验次数增大，出现正面的经验概率为 0.5 D．试验次数每增加一次，下一次出现正面的频率一定比它前一次更接近于 0.5【变式 2-3】（24-25 高二上·广东佛山·阶段练习）下列说法正确的有（） ①随机事件 A 的概率是频率的稳定值，频率是概率的估计值 ②某人打靶，射击 10 次，击中 7 次，那么此人中靶的概率 0.7 ③一位同学做掷硬币试验，掷 6 次，一定有 3 次正面朝上 ④某地发行福利彩票，回报率为 47%，有人花了 100 元钱买彩票，一定会有 47 元的回报</w:t>
       </w:r>
     </w:p>
     <w:tbl>
@@ -5026,9 +4879,7 @@
         <w:rPr>
           <w:b/>
         </w:rPr>
-        <w:t>【题型 3  天气预报、抽奖、彩票的概率解释】</w:t>
-        <w:br/>
-        <w:t>【例 3】（24-25 高一·全国·课后作业）气象站在发布天气预报时说“明天本地区降雨的概率为 90%”，你认为下列解释正确的是（）</w:t>
+        <w:t>【题型 3 天气预报、抽奖、彩票的概率解释】 【例 3】（24-25 高一·全国·课后作业）气象站在发布天气预报时说“明天本地区降雨的概率为 90%”，你认为下列解释正确的是（）</w:t>
       </w:r>
     </w:p>
     <w:p>
@@ -5051,9 +4902,7 @@
         <w:jc w:val="left"/>
       </w:pPr>
       <w:r>
-        <w:t>A．本地区有 90%的地方下雨</w:t>
-        <w:br/>
-        <w:t>C．明天出行不带雨具，一定被雨淋</w:t>
+        <w:t>A．本地区有 90%的地方下雨 C．明天出行不带雨具，一定被雨淋</w:t>
       </w:r>
     </w:p>
     <w:p>
@@ -5080,9 +4929,7 @@
         <w:jc w:val="left"/>
       </w:pPr>
       <w:r>
-        <w:t>B．本地区有 90%的时间下雨</w:t>
-        <w:br/>
-        <w:t>D．明天出行不带雨具，有 90%的可能被雨淋</w:t>
+        <w:t>B．本地区有 90%的时间下雨 D．明天出行不带雨具，有 90%的可能被雨淋</w:t>
       </w:r>
     </w:p>
     <w:p>
@@ -6164,21 +6011,7 @@
         <w:rPr>
           <w:b/>
         </w:rPr>
-        <w:t>【题型 4  其他问题中的概率解释】</w:t>
-        <w:br/>
-        <w:t>【例 4】（24-25 高二·全国·课后作业）已知使用一剂某种药物治愈某种疾病的概率为 90%，则下列说法正确的是（）</w:t>
-        <w:br/>
-        <w:tab/>
-        <w:t>A．如果有 100 个这种病人各使用一剂这样的药物，那么有 90 人会被治愈；</w:t>
-        <w:br/>
-        <w:tab/>
-        <w:t>B．如果一个患有这种疾病的病人使用两剂这样的药物就一定会被治愈；</w:t>
-        <w:br/>
-        <w:tab/>
-        <w:t>C．使用一剂这种药物治愈这种疾病的可能性是 90%；</w:t>
-        <w:br/>
-        <w:tab/>
-        <w:t>D．以上说法都不对．</w:t>
+        <w:t>【题型 4 其他问题中的概率解释】 【例 4】（24-25 高二·全国·课后作业）已知使用一剂某种药物治愈某种疾病的概率为 90%，则下列说法正确的是（） A．如果有 100 个这种病人各使用一剂这样的药物，那么有 90 人会被治愈； B．如果一个患有这种疾病的病人使用两剂这样的药物就一定会被治愈； C．使用一剂这种药物治愈这种疾病的可能性是 90%； D．以上说法都不对．</w:t>
       </w:r>
     </w:p>
     <w:p>
@@ -6473,19 +6306,7 @@
         <w:rPr>
           <w:b/>
         </w:rPr>
-        <w:t>【变式 4-2】（24-25 高二·全国·假期作业）已知某厂生产的某批产品的合格率为 90%，现从该批次产品中抽出 100 件产品检查，则下列说法正确的是（）</w:t>
-        <w:br/>
-        <w:tab/>
-        <w:t>A．合格产品少于 90 件</w:t>
-        <w:tab/>
-        <w:t>B．合格产品多于 90 件</w:t>
-        <w:br/>
-        <w:tab/>
-        <w:t>C．合格产品正好是 90 件</w:t>
-        <w:tab/>
-        <w:t>D．合格产品可能是 90 件</w:t>
-        <w:br/>
-        <w:t>【变式 4-3】（24-25 高二上·山东济宁·阶段练习）在调查运动员是否服用过兴奋剂的时候，给出两个问题作答，无关紧要的问题是：“你的身份证号码的尾数是奇数吗？”敏感的问题是：“你服用过兴奋剂吗？”然后要求被调查的运动员掷一枚硬币，如果出现正面，就回答第一个问题，否则回答第二个问题．由于回答哪一个问题只有被测试者自己知道，所以应答者一般乐意如实地回答问题．如我们把这种方法用于 300 个被调查的运动员，得到 80 个“是”的回答，则这群人中服用过兴奋剂的百分率大约为（）</w:t>
+        <w:t>【变式 4-2】（24-25 高二·全国·假期作业）已知某厂生产的某批产品的合格率为 90%，现从该批次产品中抽出 100 件产品检查，则下列说法正确的是（） A．合格产品少于 90 件 B．合格产品多于 90 件 C．合格产品正好是 90 件 D．合格产品可能是 90 件 【变式 4-3】（24-25 高二上·山东济宁·阶段练习）在调查运动员是否服用过兴奋剂的时候，给出两个问题作答，无关紧要的问题是：“你的身份证号码的尾数是奇数吗？”敏感的问题是：“你服用过兴奋剂吗？”然后要求被调查的运动员掷一枚硬币，如果出现正面，就回答第一个问题，否则回答第二个问题．由于回答哪一个问题只有被测试者自己知道，所以应答者一般乐意如实地回答问题．如我们把这种方法用于 300 个被调查的运动员，得到 80 个“是”的回答，则这群人中服用过兴奋剂的百分率大约为（）</w:t>
       </w:r>
     </w:p>
     <w:tbl>
@@ -6723,19 +6544,7 @@
         <w:rPr>
           <w:b/>
         </w:rPr>
-        <w:t>【题型 5  游戏的公平性问题】</w:t>
-        <w:br/>
-        <w:t>【例 5】（23-24 高一下·河南许昌·期末）小明与小华两人玩游戏，则下列游戏不公平的是（）</w:t>
-        <w:tab/>
-        <w:t>A．抛掷一枚骰子，向上的点数为奇数，小明获胜，向上的点数为偶数，小华获胜</w:t>
-        <w:br/>
-        <w:tab/>
-        <w:t>B．同时抛掷两枚硬币，恰有一枚正面向上，小明获胜，两枚都正面向上，小华获胜</w:t>
-        <w:br/>
-        <w:tab/>
-        <w:t>C．从一副不含大小王的扑克牌中抽一张，扑克牌是红色，小明获胜，扑克牌是黑色，小华获胜</w:t>
-        <w:tab/>
-        <w:t>D．小明、小华两人各写一个数字 6 或 8，如果两人写的数字相同，小明获胜，否则小华获胜</w:t>
+        <w:t>【题型 5 游戏的公平性问题】 【例 5】（23-24 高一下·河南许昌·期末）小明与小华两人玩游戏，则下列游戏不公平的是（） A．抛掷一枚骰子，向上的点数为奇数，小明获胜，向上的点数为偶数，小华获胜 B．同时抛掷两枚硬币，恰有一枚正面向上，小明获胜，两枚都正面向上，小华获胜 C．从一副不含大小王的扑克牌中抽一张，扑克牌是红色，小明获胜，扑克牌是黑色，小华获胜 D．小明、小华两人各写一个数字 6 或 8，如果两人写的数字相同，小明获胜，否则小华获胜</w:t>
       </w:r>
     </w:p>
     <w:p>
@@ -7966,9 +7775,7 @@
         <w:jc w:val="left"/>
       </w:pPr>
       <w:r>
-        <w:t xml:space="preserve">如果第一名同学抽到，第二名同学抽到的概率只有 4 </w:t>
-        <w:tab/>
-        <w:t>49</w:t>
+        <w:t>如果第一名同学抽到，第二名同学抽到的概率只有 4 49</w:t>
       </w:r>
     </w:p>
     <w:p>
@@ -8386,7 +8193,7 @@
         <w:rPr>
           <w:b/>
         </w:rPr>
-        <w:t>【题型 6  频率估计概率在统计中的应用】</w:t>
+        <w:t>【题型 6 频率估计概率在统计中的应用】</w:t>
       </w:r>
     </w:p>
     <w:p>
@@ -9009,13 +8816,7 @@
         <w:rPr>
           <w:b/>
         </w:rPr>
-        <w:t>【知识点 2  随机模拟】</w:t>
-        <w:br/>
-        <w:t>1．随机数的产生</w:t>
-        <w:br/>
-        <w:t>(1)随机数的定义</w:t>
-        <w:br/>
-        <w:t>随机数就是在一定范围内随机产生的数，并且得到这个范围内的每一个数的机会相等.</w:t>
+        <w:t>【知识点 2 随机模拟】 1．随机数的产生 (1)随机数的定义 随机数就是在一定范围内随机产生的数，并且得到这个范围内的每一个数的机会相等.</w:t>
       </w:r>
     </w:p>
     <w:p>
@@ -9028,47 +8829,7 @@
         <w:jc w:val="left"/>
       </w:pPr>
       <w:r>
-        <w:rPr>
-          <w:rFonts w:ascii="Liberation Serif" w:hAnsi="Liberation Serif" w:eastAsia="Liberation Serif"/>
-          <w:b w:val="0"/>
-          <w:i w:val="0"/>
-          <w:color w:val="000000"/>
-          <w:sz w:val="21"/>
-        </w:rPr>
-        <w:t>(2)</w:t>
-      </w:r>
-      <w:r>
-        <w:rPr>
-          <w:rFonts w:ascii="NotoSansCJKsc" w:hAnsi="NotoSansCJKsc" w:eastAsia="NotoSansCJKsc"/>
-          <w:b w:val="0"/>
-          <w:i w:val="0"/>
-          <w:color w:val="000000"/>
-          <w:sz w:val="21"/>
-        </w:rPr>
-        <w:t>产生随机数的方法</w:t>
-      </w:r>
-      <w:r>
-        <w:br/>
-      </w:r>
-      <w:r>
-        <w:rPr>
-          <w:rFonts w:ascii="UnBatang" w:hAnsi="UnBatang" w:eastAsia="UnBatang"/>
-          <w:b w:val="0"/>
-          <w:i w:val="0"/>
-          <w:color w:val="000000"/>
-          <w:sz w:val="21"/>
-        </w:rPr>
-        <w:t>①</w:t>
-      </w:r>
-      <w:r>
-        <w:rPr>
-          <w:rFonts w:ascii="NotoSansCJKsc" w:hAnsi="NotoSansCJKsc" w:eastAsia="NotoSansCJKsc"/>
-          <w:b w:val="0"/>
-          <w:i w:val="0"/>
-          <w:color w:val="000000"/>
-          <w:sz w:val="21"/>
-        </w:rPr>
-        <w:t>利用抽签法产生随机数</w:t>
+        <w:t>(2)产生随机数的方法 ①利用抽签法产生随机数</w:t>
       </w:r>
     </w:p>
     <w:tbl>
@@ -9508,139 +9269,7 @@
         <w:jc w:val="left"/>
       </w:pPr>
       <w:r>
-        <w:tab/>
-      </w:r>
-      <w:r>
-        <w:rPr>
-          <w:rFonts w:ascii="UnBatang" w:hAnsi="UnBatang" w:eastAsia="UnBatang"/>
-          <w:b w:val="0"/>
-          <w:i w:val="0"/>
-          <w:color w:val="000000"/>
-          <w:sz w:val="21"/>
-        </w:rPr>
-        <w:t>②</w:t>
-      </w:r>
-      <w:r>
-        <w:rPr>
-          <w:rFonts w:ascii="NotoSansCJKsc" w:hAnsi="NotoSansCJKsc" w:eastAsia="NotoSansCJKsc"/>
-          <w:b w:val="0"/>
-          <w:i w:val="0"/>
-          <w:color w:val="000000"/>
-          <w:sz w:val="21"/>
-        </w:rPr>
-        <w:t>利用计算机或计算器产生伪随机数</w:t>
-      </w:r>
-      <w:r>
-        <w:br/>
-      </w:r>
-      <w:r>
-        <w:tab/>
-      </w:r>
-      <w:r>
-        <w:rPr>
-          <w:rFonts w:ascii="NotoSansCJKsc" w:hAnsi="NotoSansCJKsc" w:eastAsia="NotoSansCJKsc"/>
-          <w:b w:val="0"/>
-          <w:i w:val="0"/>
-          <w:color w:val="000000"/>
-          <w:sz w:val="21"/>
-        </w:rPr>
-        <w:t>计算机或计算器产生的随机数是依照确定算法产生的数，具有周期性</w:t>
-      </w:r>
-      <w:r>
-        <w:rPr>
-          <w:rFonts w:ascii="Liberation Serif" w:hAnsi="Liberation Serif" w:eastAsia="Liberation Serif"/>
-          <w:b w:val="0"/>
-          <w:i w:val="0"/>
-          <w:color w:val="000000"/>
-          <w:sz w:val="21"/>
-        </w:rPr>
-        <w:t>(</w:t>
-      </w:r>
-      <w:r>
-        <w:rPr>
-          <w:rFonts w:ascii="NotoSansCJKsc" w:hAnsi="NotoSansCJKsc" w:eastAsia="NotoSansCJKsc"/>
-          <w:b w:val="0"/>
-          <w:i w:val="0"/>
-          <w:color w:val="000000"/>
-          <w:sz w:val="21"/>
-        </w:rPr>
-        <w:t>周期很长</w:t>
-      </w:r>
-      <w:r>
-        <w:rPr>
-          <w:rFonts w:ascii="Liberation Serif" w:hAnsi="Liberation Serif" w:eastAsia="Liberation Serif"/>
-          <w:b w:val="0"/>
-          <w:i w:val="0"/>
-          <w:color w:val="000000"/>
-          <w:sz w:val="21"/>
-        </w:rPr>
-        <w:t>)</w:t>
-      </w:r>
-      <w:r>
-        <w:rPr>
-          <w:rFonts w:ascii="NotoSansCJKsc" w:hAnsi="NotoSansCJKsc" w:eastAsia="NotoSansCJKsc"/>
-          <w:b w:val="0"/>
-          <w:i w:val="0"/>
-          <w:color w:val="000000"/>
-          <w:sz w:val="21"/>
-        </w:rPr>
-        <w:t>，它们具有类似随机</w:t>
-      </w:r>
-      <w:r>
-        <w:tab/>
-      </w:r>
-      <w:r>
-        <w:rPr>
-          <w:rFonts w:ascii="NotoSansCJKsc" w:hAnsi="NotoSansCJKsc" w:eastAsia="NotoSansCJKsc"/>
-          <w:b w:val="0"/>
-          <w:i w:val="0"/>
-          <w:color w:val="000000"/>
-          <w:sz w:val="21"/>
-        </w:rPr>
-        <w:t>数</w:t>
-      </w:r>
-      <w:r>
-        <w:br/>
-      </w:r>
-      <w:r>
-        <w:rPr>
-          <w:rFonts w:ascii="NotoSansCJKsc" w:hAnsi="NotoSansCJKsc" w:eastAsia="NotoSansCJKsc"/>
-          <w:b w:val="0"/>
-          <w:i w:val="0"/>
-          <w:color w:val="000000"/>
-          <w:sz w:val="21"/>
-        </w:rPr>
-        <w:t>的性质</w:t>
-      </w:r>
-      <w:r>
-        <w:rPr>
-          <w:rFonts w:ascii="Liberation Serif" w:hAnsi="Liberation Serif" w:eastAsia="Liberation Serif"/>
-          <w:b w:val="0"/>
-          <w:i w:val="0"/>
-          <w:color w:val="000000"/>
-          <w:sz w:val="21"/>
-        </w:rPr>
-        <w:t>.</w:t>
-      </w:r>
-      <w:r>
-        <w:rPr>
-          <w:rFonts w:ascii="NotoSansCJKsc" w:hAnsi="NotoSansCJKsc" w:eastAsia="NotoSansCJKsc"/>
-          <w:b w:val="0"/>
-          <w:i w:val="0"/>
-          <w:color w:val="000000"/>
-          <w:sz w:val="21"/>
-        </w:rPr>
-        <w:t>因此，计算机或计算器产生的并不是真正的随机数，我们称它们为伪随机数</w:t>
-      </w:r>
-      <w:r>
-        <w:rPr>
-          <w:rFonts w:ascii="Liberation Serif" w:hAnsi="Liberation Serif" w:eastAsia="Liberation Serif"/>
-          <w:b w:val="0"/>
-          <w:i w:val="0"/>
-          <w:color w:val="000000"/>
-          <w:sz w:val="21"/>
-        </w:rPr>
-        <w:t>.</w:t>
+        <w:t>②利用计算机或计算器产生伪随机数 计算机或计算器产生的随机数是依照确定算法产生的数，具有周期性(周期很长)，它们具有类似随机 数 的性质.因此，计算机或计算器产生的并不是真正的随机数，我们称它们为伪随机数.</w:t>
       </w:r>
     </w:p>
     <w:p>
@@ -9656,89 +9285,7 @@
         <w:jc w:val="left"/>
       </w:pPr>
       <w:r>
-        <w:tab/>
-      </w:r>
-      <w:r>
-        <w:rPr>
-          <w:rFonts w:ascii="Liberation Serif" w:hAnsi="Liberation Serif" w:eastAsia="Liberation Serif"/>
-          <w:b w:val="0"/>
-          <w:i w:val="0"/>
-          <w:color w:val="000000"/>
-          <w:sz w:val="21"/>
-        </w:rPr>
-        <w:t>(3)</w:t>
-      </w:r>
-      <w:r>
-        <w:rPr>
-          <w:rFonts w:ascii="NotoSansCJKsc" w:hAnsi="NotoSansCJKsc" w:eastAsia="NotoSansCJKsc"/>
-          <w:b w:val="0"/>
-          <w:i w:val="0"/>
-          <w:color w:val="000000"/>
-          <w:sz w:val="21"/>
-        </w:rPr>
-        <w:t>用随机模拟法估计概率</w:t>
-      </w:r>
-      <w:r>
-        <w:br/>
-      </w:r>
-      <w:r>
-        <w:tab/>
-      </w:r>
-      <w:r>
-        <w:rPr>
-          <w:rFonts w:ascii="UnBatang" w:hAnsi="UnBatang" w:eastAsia="UnBatang"/>
-          <w:b w:val="0"/>
-          <w:i w:val="0"/>
-          <w:color w:val="000000"/>
-          <w:sz w:val="21"/>
-        </w:rPr>
-        <w:t>①</w:t>
-      </w:r>
-      <w:r>
-        <w:rPr>
-          <w:rFonts w:ascii="NotoSansCJKsc" w:hAnsi="NotoSansCJKsc" w:eastAsia="NotoSansCJKsc"/>
-          <w:b w:val="0"/>
-          <w:i w:val="0"/>
-          <w:color w:val="000000"/>
-          <w:sz w:val="21"/>
-        </w:rPr>
-        <w:t>随机模拟法产生的必要性</w:t>
-      </w:r>
-      <w:r>
-        <w:br/>
-      </w:r>
-      <w:r>
-        <w:tab/>
-      </w:r>
-      <w:r>
-        <w:rPr>
-          <w:rFonts w:ascii="NotoSansCJKsc" w:hAnsi="NotoSansCJKsc" w:eastAsia="NotoSansCJKsc"/>
-          <w:b w:val="0"/>
-          <w:i w:val="0"/>
-          <w:color w:val="000000"/>
-          <w:sz w:val="21"/>
-        </w:rPr>
-        <w:t>用频率估计概率时，需做大量的重复试验，费时费力，并且有些试验具有破坏性，有些试验无法进行，</w:t>
-      </w:r>
-      <w:r>
-        <w:rPr>
-          <w:rFonts w:ascii="NotoSansCJKsc" w:hAnsi="NotoSansCJKsc" w:eastAsia="NotoSansCJKsc"/>
-          <w:b w:val="0"/>
-          <w:i w:val="0"/>
-          <w:color w:val="000000"/>
-          <w:sz w:val="21"/>
-        </w:rPr>
-        <w:t>因而随机模拟试验就成为一种重要的方法，它可以在短时间内多次重复</w:t>
-      </w:r>
-      <w:r>
-        <w:rPr>
-          <w:rFonts w:ascii="Liberation Serif" w:hAnsi="Liberation Serif" w:eastAsia="Liberation Serif"/>
-          <w:b w:val="0"/>
-          <w:i w:val="0"/>
-          <w:color w:val="000000"/>
-          <w:sz w:val="21"/>
-        </w:rPr>
-        <w:t>.</w:t>
+        <w:t>(3)用随机模拟法估计概率 ①随机模拟法产生的必要性 用频率估计概率时，需做大量的重复试验，费时费力，并且有些试验具有破坏性，有些试验无法进行，因而随机模拟试验就成为一种重要的方法，它可以在短时间内多次重复.</w:t>
       </w:r>
     </w:p>
     <w:p>
@@ -9773,73 +9320,7 @@
         <w:jc w:val="left"/>
       </w:pPr>
       <w:r>
-        <w:tab/>
-      </w:r>
-      <w:r>
-        <w:rPr>
-          <w:rFonts w:ascii="NotoSansCJKsc" w:hAnsi="NotoSansCJKsc" w:eastAsia="NotoSansCJKsc"/>
-          <w:b w:val="0"/>
-          <w:i w:val="0"/>
-          <w:color w:val="000000"/>
-          <w:sz w:val="21"/>
-        </w:rPr>
-        <w:t>②随机模拟法估计概率的思想</w:t>
-      </w:r>
-      <w:r>
-        <w:br/>
-      </w:r>
-      <w:r>
-        <w:tab/>
-      </w:r>
-      <w:r>
-        <w:rPr>
-          <w:rFonts w:ascii="NotoSansCJKsc" w:hAnsi="NotoSansCJKsc" w:eastAsia="NotoSansCJKsc"/>
-          <w:b w:val="0"/>
-          <w:i w:val="0"/>
-          <w:color w:val="000000"/>
-          <w:sz w:val="21"/>
-        </w:rPr>
-        <w:t>随机模拟法是通过将一次试验所有可能发生的结果数字化，用计算机或计算器产生的随机数来替代每</w:t>
-      </w:r>
-      <w:r>
-        <w:rPr>
-          <w:rFonts w:ascii="NotoSansCJKsc" w:hAnsi="NotoSansCJKsc" w:eastAsia="NotoSansCJKsc"/>
-          <w:b w:val="0"/>
-          <w:i w:val="0"/>
-          <w:color w:val="000000"/>
-          <w:sz w:val="21"/>
-        </w:rPr>
-        <w:t>次试验的结果</w:t>
-      </w:r>
-      <w:r>
-        <w:rPr>
-          <w:rFonts w:ascii="Liberation Serif" w:hAnsi="Liberation Serif" w:eastAsia="Liberation Serif"/>
-          <w:b w:val="0"/>
-          <w:i w:val="0"/>
-          <w:color w:val="000000"/>
-          <w:sz w:val="21"/>
-        </w:rPr>
-        <w:t>.</w:t>
-      </w:r>
-      <w:r>
-        <w:rPr>
-          <w:rFonts w:ascii="NotoSansCJKsc" w:hAnsi="NotoSansCJKsc" w:eastAsia="NotoSansCJKsc"/>
-          <w:b w:val="0"/>
-          <w:i w:val="0"/>
-          <w:color w:val="000000"/>
-          <w:sz w:val="21"/>
-        </w:rPr>
-        <w:t>其基本思想是，用产生整数值的随机数的频率估计事件发生的概率</w:t>
-      </w:r>
-      <w:r>
-        <w:rPr>
-          <w:rFonts w:ascii="Liberation Serif" w:hAnsi="Liberation Serif" w:eastAsia="Liberation Serif"/>
-          <w:b w:val="0"/>
-          <w:i w:val="0"/>
-          <w:color w:val="000000"/>
-          <w:sz w:val="21"/>
-        </w:rPr>
-        <w:t>.</w:t>
+        <w:t>②随机模拟法估计概率的思想 随机模拟法是通过将一次试验所有可能发生的结果数字化，用计算机或计算器产生的随机数来替代每次试验的结果.其基本思想是，用产生整数值的随机数的频率估计事件发生的概率.</w:t>
       </w:r>
     </w:p>
     <w:p>
@@ -9855,63 +9336,7 @@
         <w:jc w:val="left"/>
       </w:pPr>
       <w:r>
-        <w:tab/>
-      </w:r>
-      <w:r>
-        <w:rPr>
-          <w:rFonts w:ascii="UnBatang" w:hAnsi="UnBatang" w:eastAsia="UnBatang"/>
-          <w:b w:val="0"/>
-          <w:i w:val="0"/>
-          <w:color w:val="000000"/>
-          <w:sz w:val="21"/>
-        </w:rPr>
-        <w:t>③</w:t>
-      </w:r>
-      <w:r>
-        <w:rPr>
-          <w:rFonts w:ascii="NotoSansCJKsc" w:hAnsi="NotoSansCJKsc" w:eastAsia="NotoSansCJKsc"/>
-          <w:b w:val="0"/>
-          <w:i w:val="0"/>
-          <w:color w:val="000000"/>
-          <w:sz w:val="21"/>
-        </w:rPr>
-        <w:t>随机模拟法的优点</w:t>
-      </w:r>
-      <w:r>
-        <w:br/>
-      </w:r>
-      <w:r>
-        <w:tab/>
-      </w:r>
-      <w:r>
-        <w:rPr>
-          <w:rFonts w:ascii="NotoSansCJKsc" w:hAnsi="NotoSansCJKsc" w:eastAsia="NotoSansCJKsc"/>
-          <w:b w:val="0"/>
-          <w:i w:val="0"/>
-          <w:color w:val="000000"/>
-          <w:sz w:val="21"/>
-        </w:rPr>
-        <w:t>不需要对试验进行具体操作，是一种简单、实用的科研方法，可以广泛地应用到生产生活的各个领域</w:t>
-      </w:r>
-      <w:r>
-        <w:rPr>
-          <w:rFonts w:ascii="NotoSansCJKsc" w:hAnsi="NotoSansCJKsc" w:eastAsia="NotoSansCJKsc"/>
-          <w:b w:val="0"/>
-          <w:i w:val="0"/>
-          <w:color w:val="000000"/>
-          <w:sz w:val="21"/>
-        </w:rPr>
-        <w:t>中去</w:t>
-      </w:r>
-      <w:r>
-        <w:rPr>
-          <w:rFonts w:ascii="Liberation Serif" w:hAnsi="Liberation Serif" w:eastAsia="Liberation Serif"/>
-          <w:b w:val="0"/>
-          <w:i w:val="0"/>
-          <w:color w:val="000000"/>
-          <w:sz w:val="21"/>
-        </w:rPr>
-        <w:t>.</w:t>
+        <w:t>③随机模拟法的优点 不需要对试验进行具体操作，是一种简单、实用的科研方法，可以广泛地应用到生产生活的各个领域中去.</w:t>
       </w:r>
     </w:p>
     <w:p>
@@ -9924,87 +9349,7 @@
         <w:jc w:val="left"/>
       </w:pPr>
       <w:r>
-        <w:rPr>
-          <w:rFonts w:ascii="UnBatang" w:hAnsi="UnBatang" w:eastAsia="UnBatang"/>
-          <w:b w:val="0"/>
-          <w:i w:val="0"/>
-          <w:color w:val="000000"/>
-          <w:sz w:val="21"/>
-        </w:rPr>
-        <w:t>④</w:t>
-      </w:r>
-      <w:r>
-        <w:rPr>
-          <w:rFonts w:ascii="NotoSansCJKsc" w:hAnsi="NotoSansCJKsc" w:eastAsia="NotoSansCJKsc"/>
-          <w:b w:val="0"/>
-          <w:i w:val="0"/>
-          <w:color w:val="000000"/>
-          <w:sz w:val="21"/>
-        </w:rPr>
-        <w:t>随机模拟法的步骤</w:t>
-      </w:r>
-      <w:r>
-        <w:br/>
-      </w:r>
-      <w:r>
-        <w:rPr>
-          <w:rFonts w:ascii="NotoSansCJKsc" w:hAnsi="NotoSansCJKsc" w:eastAsia="NotoSansCJKsc"/>
-          <w:b w:val="0"/>
-          <w:i w:val="0"/>
-          <w:color w:val="000000"/>
-          <w:sz w:val="21"/>
-        </w:rPr>
-        <w:t>建立概率模型；进行模拟试验</w:t>
-      </w:r>
-      <w:r>
-        <w:rPr>
-          <w:rFonts w:ascii="Liberation Serif" w:hAnsi="Liberation Serif" w:eastAsia="Liberation Serif"/>
-          <w:b w:val="0"/>
-          <w:i w:val="0"/>
-          <w:color w:val="000000"/>
-          <w:sz w:val="21"/>
-        </w:rPr>
-        <w:t>(</w:t>
-      </w:r>
-      <w:r>
-        <w:rPr>
-          <w:rFonts w:ascii="NotoSansCJKsc" w:hAnsi="NotoSansCJKsc" w:eastAsia="NotoSansCJKsc"/>
-          <w:b w:val="0"/>
-          <w:i w:val="0"/>
-          <w:color w:val="000000"/>
-          <w:sz w:val="21"/>
-        </w:rPr>
-        <w:t>可用计算器或计算机进行</w:t>
-      </w:r>
-      <w:r>
-        <w:rPr>
-          <w:rFonts w:ascii="Liberation Serif" w:hAnsi="Liberation Serif" w:eastAsia="Liberation Serif"/>
-          <w:b w:val="0"/>
-          <w:i w:val="0"/>
-          <w:color w:val="000000"/>
-          <w:sz w:val="21"/>
-        </w:rPr>
-        <w:t>)</w:t>
-      </w:r>
-      <w:r>
-        <w:rPr>
-          <w:rFonts w:ascii="NotoSansCJKsc" w:hAnsi="NotoSansCJKsc" w:eastAsia="NotoSansCJKsc"/>
-          <w:b w:val="0"/>
-          <w:i w:val="0"/>
-          <w:color w:val="000000"/>
-          <w:sz w:val="21"/>
-        </w:rPr>
-        <w:t>；统计试验结果</w:t>
-      </w:r>
-      <w:r>
-        <w:rPr>
-          <w:rFonts w:ascii="Liberation Serif" w:hAnsi="Liberation Serif" w:eastAsia="Liberation Serif"/>
-          <w:b w:val="0"/>
-          <w:i w:val="0"/>
-          <w:color w:val="000000"/>
-          <w:sz w:val="21"/>
-        </w:rPr>
-        <w:t>.</w:t>
+        <w:t>④随机模拟法的步骤 建立概率模型；进行模拟试验(可用计算器或计算机进行)；统计试验结果.</w:t>
       </w:r>
     </w:p>
     <w:p>
@@ -10020,9 +9365,7 @@
         <w:rPr>
           <w:b/>
         </w:rPr>
-        <w:t>【题型 7  随机模拟问题】</w:t>
-        <w:br/>
-        <w:t>【例 7】（23-24 高一下·广东潮州·期末）已知某种设备在一年内需要维修的概率为 0.2.用计算器产生 1~5 之间的随机数，当出现随机数 1 时，表示一年内需要维修，其概率为 0.2，由于有 3 台设备，所以每 3 个随机数为一组，代表 3 台设备年内需要维修的情况，现产生 20 组随机数如下：</w:t>
+        <w:t>【题型 7 随机模拟问题】 【例 7】（23-24 高一下·广东潮州·期末）已知某种设备在一年内需要维修的概率为 0.2.用计算器产生 1~5 之间的随机数，当出现随机数 1 时，表示一年内需要维修，其概率为 0.2，由于有 3 台设备，所以每 3 个随机数为一组，代表 3 台设备年内需要维修的情况，现产生 20 组随机数如下：</w:t>
       </w:r>
     </w:p>
     <w:p>
@@ -10135,9 +9478,7 @@
         <w:t>142</w:t>
       </w:r>
       <w:r>
-        <w:t xml:space="preserve"> 435414335132123233314232353442</w:t>
-        <w:br/>
-        <w:t>据此估计一年内这 3 台设备都不需要维修的概率为（）</w:t>
+        <w:t xml:space="preserve"> 435414335132123233314232353442 据此估计一年内这 3 台设备都不需要维修的概率为（）</w:t>
       </w:r>
     </w:p>
     <w:tbl>
@@ -10720,9 +10061,7 @@
         <w:t>342</w:t>
       </w:r>
       <w:r>
-        <w:t xml:space="preserve"> 534443512541125432334151314354</w:t>
-        <w:br/>
-        <w:t>则估计在本次比赛中甲获得冠军的概率是（）</w:t>
+        <w:t xml:space="preserve"> 534443512541125432334151314354 则估计在本次比赛中甲获得冠军的概率是（）</w:t>
       </w:r>
     </w:p>
     <w:tbl>
@@ -11066,11 +10405,7 @@
         <w:jc w:val="left"/>
       </w:pPr>
       <w:r>
-        <w:t xml:space="preserve">116785812730134452125689024169 </w:t>
-        <w:br/>
-        <w:t>334217109361908284044147318027</w:t>
-        <w:br/>
-        <w:t>若用 0，1，2，3，4，5 表示高温橙色预警，用 6，7，8，9 表示非高温橙色预警，则今后的 3 天中恰有 2 天发布高温橙色预警信号的概率估计是（）</w:t>
+        <w:t>116785812730134452125689024169 334217109361908284044147318027 若用 0，1，2，3，4，5 表示高温橙色预警，用 6，7，8，9 表示非高温橙色预警，则今后的 3 天中恰有 2 天发布高温橙色预警信号的概率估计是（）</w:t>
       </w:r>
     </w:p>
     <w:tbl>

</xml_diff>